<commit_message>
job-search: apply to Yourgi VP of Engineering (90/100), move to done
Humanized the resume + cover letter (removed negative parallelism from
the cover letter), moved the card to done (status: applied). Includes the
Alight apply log entries and template updates (new email + AI Makerspace
cert) generated this session.

Co-Authored-By: Claude Opus 4.6 <noreply@anthropic.com>
</commit_message>
<xml_diff>
--- a/Machine/Templates/cover-letter-reference.docx
+++ b/Machine/Templates/cover-letter-reference.docx
@@ -135,7 +135,7 @@
                                 <w:sz w:val="18"/>
                                 <w:szCs w:val="18"/>
                               </w:rPr>
-                              <w:t>chris@monnat.org</w:t>
+                              <w:t>cmmonnat@gmail.com</w:t>
                             </w:r>
                             <w:r>
                               <w:rPr>
@@ -277,7 +277,7 @@
                           <w:sz w:val="18"/>
                           <w:szCs w:val="18"/>
                         </w:rPr>
-                        <w:t>chris@monnat.org</w:t>
+                        <w:t>cmmonnat@gmail.com</w:t>
                       </w:r>
                       <w:r>
                         <w:rPr>

</xml_diff>